<commit_message>
implemented AI Code from part 1 into a vector of People objects and assigned the data it read from the CSV file into a person for each object in the vector
</commit_message>
<xml_diff>
--- a/project1(1).docx
+++ b/project1(1).docx
@@ -1,6 +1,6 @@
 
 <file path=word/document.xml><?xml version="1.0" encoding="utf-8"?>
-<w:document xmlns:wpc="http://schemas.microsoft.com/office/word/2010/wordprocessingCanvas" xmlns:cx="http://schemas.microsoft.com/office/drawing/2014/chartex" xmlns:cx1="http://schemas.microsoft.com/office/drawing/2015/9/8/chartex" xmlns:cx2="http://schemas.microsoft.com/office/drawing/2015/10/21/chartex" xmlns:cx3="http://schemas.microsoft.com/office/drawing/2016/5/9/chartex" xmlns:cx4="http://schemas.microsoft.com/office/drawing/2016/5/10/chartex" xmlns:cx5="http://schemas.microsoft.com/office/drawing/2016/5/11/chartex" xmlns:cx6="http://schemas.microsoft.com/office/drawing/2016/5/12/chartex" xmlns:cx7="http://schemas.microsoft.com/office/drawing/2016/5/13/chartex" xmlns:cx8="http://schemas.microsoft.com/office/drawing/2016/5/14/chartex" xmlns:mc="http://schemas.openxmlformats.org/markup-compatibility/2006" xmlns:aink="http://schemas.microsoft.com/office/drawing/2016/ink" xmlns:am3d="http://schemas.microsoft.com/office/drawing/2017/model3d" xmlns:o="urn:schemas-microsoft-com:office:office" xmlns:oel="http://schemas.microsoft.com/office/2019/extlst" xmlns:r="http://schemas.openxmlformats.org/officeDocument/2006/relationships" xmlns:m="http://schemas.openxmlformats.org/officeDocument/2006/math" xmlns:v="urn:schemas-microsoft-com:vml" xmlns:wp14="http://schemas.microsoft.com/office/word/2010/wordprocessingDrawing" xmlns:wp="http://schemas.openxmlformats.org/drawingml/2006/wordprocessingDrawing" xmlns:w10="urn:schemas-microsoft-com:office:word" xmlns:w="http://schemas.openxmlformats.org/wordprocessingml/2006/main" xmlns:w14="http://schemas.microsoft.com/office/word/2010/wordml" xmlns:w15="http://schemas.microsoft.com/office/word/2012/wordml" xmlns:w16cex="http://schemas.microsoft.com/office/word/2018/wordml/cex" xmlns:w16cid="http://schemas.microsoft.com/office/word/2016/wordml/cid" xmlns:w16="http://schemas.microsoft.com/office/word/2018/wordml" xmlns:w16du="http://schemas.microsoft.com/office/word/2023/wordml/word16du" xmlns:w16sdtdh="http://schemas.microsoft.com/office/word/2020/wordml/sdtdatahash" xmlns:w16se="http://schemas.microsoft.com/office/word/2015/wordml/symex" xmlns:wpg="http://schemas.microsoft.com/office/word/2010/wordprocessingGroup" xmlns:wpi="http://schemas.microsoft.com/office/word/2010/wordprocessingInk" xmlns:wne="http://schemas.microsoft.com/office/word/2006/wordml" xmlns:wps="http://schemas.microsoft.com/office/word/2010/wordprocessingShape" mc:Ignorable="w14 w15 w16se w16cid w16 w16cex w16sdtdh w16du wp14">
+<w:document xmlns:wpc="http://schemas.microsoft.com/office/word/2010/wordprocessingCanvas" xmlns:cx="http://schemas.microsoft.com/office/drawing/2014/chartex" xmlns:cx1="http://schemas.microsoft.com/office/drawing/2015/9/8/chartex" xmlns:cx2="http://schemas.microsoft.com/office/drawing/2015/10/21/chartex" xmlns:cx3="http://schemas.microsoft.com/office/drawing/2016/5/9/chartex" xmlns:cx4="http://schemas.microsoft.com/office/drawing/2016/5/10/chartex" xmlns:cx5="http://schemas.microsoft.com/office/drawing/2016/5/11/chartex" xmlns:cx6="http://schemas.microsoft.com/office/drawing/2016/5/12/chartex" xmlns:cx7="http://schemas.microsoft.com/office/drawing/2016/5/13/chartex" xmlns:cx8="http://schemas.microsoft.com/office/drawing/2016/5/14/chartex" xmlns:mc="http://schemas.openxmlformats.org/markup-compatibility/2006" xmlns:aink="http://schemas.microsoft.com/office/drawing/2016/ink" xmlns:am3d="http://schemas.microsoft.com/office/drawing/2017/model3d" xmlns:o="urn:schemas-microsoft-com:office:office" xmlns:oel="http://schemas.microsoft.com/office/2019/extlst" xmlns:r="http://schemas.openxmlformats.org/officeDocument/2006/relationships" xmlns:m="http://schemas.openxmlformats.org/officeDocument/2006/math" xmlns:v="urn:schemas-microsoft-com:vml" xmlns:wp14="http://schemas.microsoft.com/office/word/2010/wordprocessingDrawing" xmlns:wp="http://schemas.openxmlformats.org/drawingml/2006/wordprocessingDrawing" xmlns:w10="urn:schemas-microsoft-com:office:word" xmlns:w="http://schemas.openxmlformats.org/wordprocessingml/2006/main" xmlns:w14="http://schemas.microsoft.com/office/word/2010/wordml" xmlns:w15="http://schemas.microsoft.com/office/word/2012/wordml" xmlns:w16cei="http://schemas.microsoft.com/office/word/2026/wordml/cei" xmlns:w16cex="http://schemas.microsoft.com/office/word/2018/wordml/cex" xmlns:w16cid="http://schemas.microsoft.com/office/word/2016/wordml/cid" xmlns:w16="http://schemas.microsoft.com/office/word/2018/wordml" xmlns:w16du="http://schemas.microsoft.com/office/word/2023/wordml/word16du" xmlns:w16sdtdh="http://schemas.microsoft.com/office/word/2020/wordml/sdtdatahash" xmlns:w16sdtfl="http://schemas.microsoft.com/office/word/2024/wordml/sdtformatlock" xmlns:w16se="http://schemas.microsoft.com/office/word/2015/wordml/symex" xmlns:wpg="http://schemas.microsoft.com/office/word/2010/wordprocessingGroup" xmlns:wpi="http://schemas.microsoft.com/office/word/2010/wordprocessingInk" xmlns:wne="http://schemas.microsoft.com/office/word/2006/wordml" xmlns:wps="http://schemas.microsoft.com/office/word/2010/wordprocessingShape" mc:Ignorable="w14 w15 w16se w16cid w16 w16cex w16sdtdh w16sdtfl w16du wp14">
   <w:body>
     <w:p>
       <w:pPr>
@@ -484,78 +484,84 @@
       <w:pPr>
         <w:rPr>
           <w:rFonts w:ascii="Calibri" w:hAnsi="Calibri" w:cs="Calibri"/>
+          <w:color w:val="4EA72E" w:themeColor="accent6"/>
           <w:u w:val="single"/>
         </w:rPr>
       </w:pPr>
       <w:r>
         <w:rPr>
           <w:rFonts w:ascii="Calibri" w:hAnsi="Calibri" w:cs="Calibri"/>
-        </w:rPr>
-        <w:t>Create</w:t>
-      </w:r>
-      <w:r>
-        <w:rPr>
-          <w:rFonts w:ascii="Calibri" w:hAnsi="Calibri" w:cs="Calibri"/>
-        </w:rPr>
-        <w:t xml:space="preserve"> a C++ </w:t>
-      </w:r>
-      <w:r>
-        <w:rPr>
-          <w:rFonts w:ascii="Calibri" w:hAnsi="Calibri" w:cs="Calibri"/>
+          <w:color w:val="4EA72E" w:themeColor="accent6"/>
+        </w:rPr>
+        <w:t xml:space="preserve">Create a C++ </w:t>
+      </w:r>
+      <w:r>
+        <w:rPr>
+          <w:rFonts w:ascii="Calibri" w:hAnsi="Calibri" w:cs="Calibri"/>
+          <w:color w:val="4EA72E" w:themeColor="accent6"/>
         </w:rPr>
         <w:t>Person</w:t>
       </w:r>
       <w:r>
         <w:rPr>
           <w:rFonts w:ascii="Calibri" w:hAnsi="Calibri" w:cs="Calibri"/>
+          <w:color w:val="4EA72E" w:themeColor="accent6"/>
         </w:rPr>
         <w:t xml:space="preserve"> class that stores </w:t>
       </w:r>
       <w:r>
         <w:rPr>
           <w:rFonts w:ascii="Calibri" w:hAnsi="Calibri" w:cs="Calibri"/>
+          <w:color w:val="4EA72E" w:themeColor="accent6"/>
         </w:rPr>
         <w:t>the</w:t>
       </w:r>
       <w:r>
         <w:rPr>
           <w:rFonts w:ascii="Calibri" w:hAnsi="Calibri" w:cs="Calibri"/>
+          <w:color w:val="4EA72E" w:themeColor="accent6"/>
         </w:rPr>
         <w:t xml:space="preserve"> data fields above in private variables. Your class should have a basic constructor, a copy constructor, a destructor, get/set methods for </w:t>
       </w:r>
       <w:r>
         <w:rPr>
           <w:rFonts w:ascii="Calibri" w:hAnsi="Calibri" w:cs="Calibri"/>
+          <w:color w:val="4EA72E" w:themeColor="accent6"/>
         </w:rPr>
         <w:t>all</w:t>
       </w:r>
       <w:r>
         <w:rPr>
           <w:rFonts w:ascii="Calibri" w:hAnsi="Calibri" w:cs="Calibri"/>
+          <w:color w:val="4EA72E" w:themeColor="accent6"/>
         </w:rPr>
         <w:t xml:space="preserve"> data fields, and a print method. You should put the class header in “</w:t>
       </w:r>
       <w:r>
         <w:rPr>
           <w:rFonts w:ascii="Calibri" w:hAnsi="Calibri" w:cs="Calibri"/>
+          <w:color w:val="4EA72E" w:themeColor="accent6"/>
         </w:rPr>
         <w:t>p</w:t>
       </w:r>
       <w:r>
         <w:rPr>
           <w:rFonts w:ascii="Calibri" w:hAnsi="Calibri" w:cs="Calibri"/>
+          <w:color w:val="4EA72E" w:themeColor="accent6"/>
         </w:rPr>
         <w:t>erson</w:t>
       </w:r>
       <w:r>
         <w:rPr>
           <w:rFonts w:ascii="Calibri" w:hAnsi="Calibri" w:cs="Calibri"/>
+          <w:color w:val="4EA72E" w:themeColor="accent6"/>
         </w:rPr>
         <w:t xml:space="preserve">.h” and your class </w:t>
       </w:r>
       <w:r>
         <w:rPr>
           <w:rFonts w:ascii="Calibri" w:hAnsi="Calibri" w:cs="Calibri"/>
+          <w:color w:val="4EA72E" w:themeColor="accent6"/>
         </w:rPr>
         <w:lastRenderedPageBreak/>
         <w:t>implementation in “</w:t>
@@ -563,48 +569,56 @@
       <w:r>
         <w:rPr>
           <w:rFonts w:ascii="Calibri" w:hAnsi="Calibri" w:cs="Calibri"/>
+          <w:color w:val="4EA72E" w:themeColor="accent6"/>
         </w:rPr>
         <w:t>person</w:t>
       </w:r>
       <w:r>
         <w:rPr>
           <w:rFonts w:ascii="Calibri" w:hAnsi="Calibri" w:cs="Calibri"/>
+          <w:color w:val="4EA72E" w:themeColor="accent6"/>
         </w:rPr>
         <w:t xml:space="preserve">.cpp”. </w:t>
       </w:r>
       <w:r>
         <w:rPr>
           <w:rFonts w:ascii="Calibri" w:hAnsi="Calibri" w:cs="Calibri"/>
+          <w:color w:val="4EA72E" w:themeColor="accent6"/>
         </w:rPr>
         <w:t>T</w:t>
       </w:r>
       <w:r>
         <w:rPr>
           <w:rFonts w:ascii="Calibri" w:hAnsi="Calibri" w:cs="Calibri"/>
+          <w:color w:val="4EA72E" w:themeColor="accent6"/>
         </w:rPr>
         <w:t xml:space="preserve">o test and debug your </w:t>
       </w:r>
       <w:r>
         <w:rPr>
           <w:rFonts w:ascii="Calibri" w:hAnsi="Calibri" w:cs="Calibri"/>
+          <w:color w:val="4EA72E" w:themeColor="accent6"/>
         </w:rPr>
         <w:t>Person</w:t>
       </w:r>
       <w:r>
         <w:rPr>
           <w:rFonts w:ascii="Calibri" w:hAnsi="Calibri" w:cs="Calibri"/>
+          <w:color w:val="4EA72E" w:themeColor="accent6"/>
         </w:rPr>
         <w:t xml:space="preserve"> class, you should create a very small “main.cpp” file that creates and initializes a </w:t>
       </w:r>
       <w:r>
         <w:rPr>
           <w:rFonts w:ascii="Calibri" w:hAnsi="Calibri" w:cs="Calibri"/>
+          <w:color w:val="4EA72E" w:themeColor="accent6"/>
         </w:rPr>
         <w:t>Person</w:t>
       </w:r>
       <w:r>
         <w:rPr>
           <w:rFonts w:ascii="Calibri" w:hAnsi="Calibri" w:cs="Calibri"/>
+          <w:color w:val="4EA72E" w:themeColor="accent6"/>
         </w:rPr>
         <w:t xml:space="preserve"> object and prints it out to the screen.</w:t>
       </w:r>
@@ -2013,7 +2027,7 @@
 </file>
 
 <file path=word/numbering.xml><?xml version="1.0" encoding="utf-8"?>
-<w:numbering xmlns:wpc="http://schemas.microsoft.com/office/word/2010/wordprocessingCanvas" xmlns:cx="http://schemas.microsoft.com/office/drawing/2014/chartex" xmlns:cx1="http://schemas.microsoft.com/office/drawing/2015/9/8/chartex" xmlns:cx2="http://schemas.microsoft.com/office/drawing/2015/10/21/chartex" xmlns:cx3="http://schemas.microsoft.com/office/drawing/2016/5/9/chartex" xmlns:cx4="http://schemas.microsoft.com/office/drawing/2016/5/10/chartex" xmlns:cx5="http://schemas.microsoft.com/office/drawing/2016/5/11/chartex" xmlns:cx6="http://schemas.microsoft.com/office/drawing/2016/5/12/chartex" xmlns:cx7="http://schemas.microsoft.com/office/drawing/2016/5/13/chartex" xmlns:cx8="http://schemas.microsoft.com/office/drawing/2016/5/14/chartex" xmlns:mc="http://schemas.openxmlformats.org/markup-compatibility/2006" xmlns:aink="http://schemas.microsoft.com/office/drawing/2016/ink" xmlns:am3d="http://schemas.microsoft.com/office/drawing/2017/model3d" xmlns:o="urn:schemas-microsoft-com:office:office" xmlns:oel="http://schemas.microsoft.com/office/2019/extlst" xmlns:r="http://schemas.openxmlformats.org/officeDocument/2006/relationships" xmlns:m="http://schemas.openxmlformats.org/officeDocument/2006/math" xmlns:v="urn:schemas-microsoft-com:vml" xmlns:wp14="http://schemas.microsoft.com/office/word/2010/wordprocessingDrawing" xmlns:wp="http://schemas.openxmlformats.org/drawingml/2006/wordprocessingDrawing" xmlns:w10="urn:schemas-microsoft-com:office:word" xmlns:w="http://schemas.openxmlformats.org/wordprocessingml/2006/main" xmlns:w14="http://schemas.microsoft.com/office/word/2010/wordml" xmlns:w15="http://schemas.microsoft.com/office/word/2012/wordml" xmlns:w16cex="http://schemas.microsoft.com/office/word/2018/wordml/cex" xmlns:w16cid="http://schemas.microsoft.com/office/word/2016/wordml/cid" xmlns:w16="http://schemas.microsoft.com/office/word/2018/wordml" xmlns:w16du="http://schemas.microsoft.com/office/word/2023/wordml/word16du" xmlns:w16sdtdh="http://schemas.microsoft.com/office/word/2020/wordml/sdtdatahash" xmlns:w16se="http://schemas.microsoft.com/office/word/2015/wordml/symex" xmlns:wpg="http://schemas.microsoft.com/office/word/2010/wordprocessingGroup" xmlns:wpi="http://schemas.microsoft.com/office/word/2010/wordprocessingInk" xmlns:wne="http://schemas.microsoft.com/office/word/2006/wordml" xmlns:wps="http://schemas.microsoft.com/office/word/2010/wordprocessingShape" mc:Ignorable="w14 w15 w16se w16cid w16 w16cex w16sdtdh w16du wp14">
+<w:numbering xmlns:wpc="http://schemas.microsoft.com/office/word/2010/wordprocessingCanvas" xmlns:cx="http://schemas.microsoft.com/office/drawing/2014/chartex" xmlns:cx1="http://schemas.microsoft.com/office/drawing/2015/9/8/chartex" xmlns:cx2="http://schemas.microsoft.com/office/drawing/2015/10/21/chartex" xmlns:cx3="http://schemas.microsoft.com/office/drawing/2016/5/9/chartex" xmlns:cx4="http://schemas.microsoft.com/office/drawing/2016/5/10/chartex" xmlns:cx5="http://schemas.microsoft.com/office/drawing/2016/5/11/chartex" xmlns:cx6="http://schemas.microsoft.com/office/drawing/2016/5/12/chartex" xmlns:cx7="http://schemas.microsoft.com/office/drawing/2016/5/13/chartex" xmlns:cx8="http://schemas.microsoft.com/office/drawing/2016/5/14/chartex" xmlns:mc="http://schemas.openxmlformats.org/markup-compatibility/2006" xmlns:aink="http://schemas.microsoft.com/office/drawing/2016/ink" xmlns:am3d="http://schemas.microsoft.com/office/drawing/2017/model3d" xmlns:o="urn:schemas-microsoft-com:office:office" xmlns:oel="http://schemas.microsoft.com/office/2019/extlst" xmlns:r="http://schemas.openxmlformats.org/officeDocument/2006/relationships" xmlns:m="http://schemas.openxmlformats.org/officeDocument/2006/math" xmlns:v="urn:schemas-microsoft-com:vml" xmlns:wp14="http://schemas.microsoft.com/office/word/2010/wordprocessingDrawing" xmlns:wp="http://schemas.openxmlformats.org/drawingml/2006/wordprocessingDrawing" xmlns:w10="urn:schemas-microsoft-com:office:word" xmlns:w="http://schemas.openxmlformats.org/wordprocessingml/2006/main" xmlns:w14="http://schemas.microsoft.com/office/word/2010/wordml" xmlns:w15="http://schemas.microsoft.com/office/word/2012/wordml" xmlns:w16cei="http://schemas.microsoft.com/office/word/2026/wordml/cei" xmlns:w16cex="http://schemas.microsoft.com/office/word/2018/wordml/cex" xmlns:w16cid="http://schemas.microsoft.com/office/word/2016/wordml/cid" xmlns:w16="http://schemas.microsoft.com/office/word/2018/wordml" xmlns:w16du="http://schemas.microsoft.com/office/word/2023/wordml/word16du" xmlns:w16sdtdh="http://schemas.microsoft.com/office/word/2020/wordml/sdtdatahash" xmlns:w16sdtfl="http://schemas.microsoft.com/office/word/2024/wordml/sdtformatlock" xmlns:w16se="http://schemas.microsoft.com/office/word/2015/wordml/symex" xmlns:wpg="http://schemas.microsoft.com/office/word/2010/wordprocessingGroup" xmlns:wpi="http://schemas.microsoft.com/office/word/2010/wordprocessingInk" xmlns:wne="http://schemas.microsoft.com/office/word/2006/wordml" xmlns:wps="http://schemas.microsoft.com/office/word/2010/wordprocessingShape" mc:Ignorable="w14 w15 w16se w16cid w16 w16cex w16sdtdh w16sdtfl w16du wp14">
   <w:abstractNum w:abstractNumId="0" w15:restartNumberingAfterBreak="0">
     <w:nsid w:val="00A03202"/>
     <w:multiLevelType w:val="hybridMultilevel"/>
@@ -2594,7 +2608,7 @@
 </file>
 
 <file path=word/styles.xml><?xml version="1.0" encoding="utf-8"?>
-<w:styles xmlns:mc="http://schemas.openxmlformats.org/markup-compatibility/2006" xmlns:r="http://schemas.openxmlformats.org/officeDocument/2006/relationships" xmlns:w="http://schemas.openxmlformats.org/wordprocessingml/2006/main" xmlns:w14="http://schemas.microsoft.com/office/word/2010/wordml" xmlns:w15="http://schemas.microsoft.com/office/word/2012/wordml" xmlns:w16cex="http://schemas.microsoft.com/office/word/2018/wordml/cex" xmlns:w16cid="http://schemas.microsoft.com/office/word/2016/wordml/cid" xmlns:w16="http://schemas.microsoft.com/office/word/2018/wordml" xmlns:w16du="http://schemas.microsoft.com/office/word/2023/wordml/word16du" xmlns:w16sdtdh="http://schemas.microsoft.com/office/word/2020/wordml/sdtdatahash" xmlns:w16se="http://schemas.microsoft.com/office/word/2015/wordml/symex" mc:Ignorable="w14 w15 w16se w16cid w16 w16cex w16sdtdh w16du">
+<w:styles xmlns:mc="http://schemas.openxmlformats.org/markup-compatibility/2006" xmlns:r="http://schemas.openxmlformats.org/officeDocument/2006/relationships" xmlns:w="http://schemas.openxmlformats.org/wordprocessingml/2006/main" xmlns:w14="http://schemas.microsoft.com/office/word/2010/wordml" xmlns:w15="http://schemas.microsoft.com/office/word/2012/wordml" xmlns:w16cex="http://schemas.microsoft.com/office/word/2018/wordml/cex" xmlns:w16cid="http://schemas.microsoft.com/office/word/2016/wordml/cid" xmlns:w16="http://schemas.microsoft.com/office/word/2018/wordml" xmlns:w16du="http://schemas.microsoft.com/office/word/2023/wordml/word16du" xmlns:w16sdtdh="http://schemas.microsoft.com/office/word/2020/wordml/sdtdatahash" xmlns:w16sdtfl="http://schemas.microsoft.com/office/word/2024/wordml/sdtformatlock" xmlns:w16se="http://schemas.microsoft.com/office/word/2015/wordml/symex" mc:Ignorable="w14 w15 w16se w16cid w16 w16cex w16sdtdh w16sdtfl w16du">
   <w:docDefaults>
     <w:rPrDefault>
       <w:rPr>

</xml_diff>

<commit_message>
Added a printMenu function and a getUserInput function with error checking
</commit_message>
<xml_diff>
--- a/project1(1).docx
+++ b/project1(1).docx
@@ -634,155 +634,181 @@
       <w:pPr>
         <w:rPr>
           <w:rFonts w:ascii="Calibri" w:hAnsi="Calibri" w:cs="Calibri"/>
-        </w:rPr>
-      </w:pPr>
-      <w:r>
-        <w:rPr>
-          <w:rFonts w:ascii="Calibri" w:hAnsi="Calibri" w:cs="Calibri"/>
+          <w:color w:val="4EA72E" w:themeColor="accent6"/>
+        </w:rPr>
+      </w:pPr>
+      <w:r>
+        <w:rPr>
+          <w:rFonts w:ascii="Calibri" w:hAnsi="Calibri" w:cs="Calibri"/>
+          <w:color w:val="4EA72E" w:themeColor="accent6"/>
         </w:rPr>
         <w:t>Write a C++ function that reads the “</w:t>
       </w:r>
       <w:r>
         <w:rPr>
           <w:rFonts w:ascii="Calibri" w:hAnsi="Calibri" w:cs="Calibri"/>
+          <w:color w:val="4EA72E" w:themeColor="accent6"/>
         </w:rPr>
         <w:t>person.csv</w:t>
       </w:r>
       <w:r>
         <w:rPr>
           <w:rFonts w:ascii="Calibri" w:hAnsi="Calibri" w:cs="Calibri"/>
+          <w:color w:val="4EA72E" w:themeColor="accent6"/>
         </w:rPr>
         <w:t xml:space="preserve">” file and creates a vector of </w:t>
       </w:r>
       <w:r>
         <w:rPr>
           <w:rFonts w:ascii="Calibri" w:hAnsi="Calibri" w:cs="Calibri"/>
+          <w:color w:val="4EA72E" w:themeColor="accent6"/>
         </w:rPr>
         <w:t>Person</w:t>
       </w:r>
       <w:r>
         <w:rPr>
           <w:rFonts w:ascii="Calibri" w:hAnsi="Calibri" w:cs="Calibri"/>
+          <w:color w:val="4EA72E" w:themeColor="accent6"/>
         </w:rPr>
         <w:t xml:space="preserve"> objects using this information. Your function should reuse the file I/O code produced in </w:t>
       </w:r>
       <w:r>
         <w:rPr>
           <w:rFonts w:ascii="Calibri" w:hAnsi="Calibri" w:cs="Calibri"/>
+          <w:color w:val="4EA72E" w:themeColor="accent6"/>
         </w:rPr>
         <w:t>Part</w:t>
       </w:r>
       <w:r>
         <w:rPr>
           <w:rFonts w:ascii="Calibri" w:hAnsi="Calibri" w:cs="Calibri"/>
+          <w:color w:val="4EA72E" w:themeColor="accent6"/>
         </w:rPr>
         <w:t xml:space="preserve"> 1 and the </w:t>
       </w:r>
       <w:r>
         <w:rPr>
           <w:rFonts w:ascii="Calibri" w:hAnsi="Calibri" w:cs="Calibri"/>
+          <w:color w:val="4EA72E" w:themeColor="accent6"/>
         </w:rPr>
         <w:t>Person</w:t>
       </w:r>
       <w:r>
         <w:rPr>
           <w:rFonts w:ascii="Calibri" w:hAnsi="Calibri" w:cs="Calibri"/>
+          <w:color w:val="4EA72E" w:themeColor="accent6"/>
         </w:rPr>
         <w:t xml:space="preserve"> class </w:t>
       </w:r>
       <w:r>
         <w:rPr>
           <w:rFonts w:ascii="Calibri" w:hAnsi="Calibri" w:cs="Calibri"/>
+          <w:color w:val="4EA72E" w:themeColor="accent6"/>
         </w:rPr>
         <w:t>your created above</w:t>
       </w:r>
       <w:r>
         <w:rPr>
           <w:rFonts w:ascii="Calibri" w:hAnsi="Calibri" w:cs="Calibri"/>
+          <w:color w:val="4EA72E" w:themeColor="accent6"/>
         </w:rPr>
         <w:t xml:space="preserve">. </w:t>
       </w:r>
       <w:r>
         <w:rPr>
           <w:rFonts w:ascii="Calibri" w:hAnsi="Calibri" w:cs="Calibri"/>
+          <w:color w:val="4EA72E" w:themeColor="accent6"/>
         </w:rPr>
         <w:t>The easiest way to add Person objects into a vector is to use the “push_back” method.</w:t>
       </w:r>
       <w:r>
         <w:rPr>
           <w:rFonts w:ascii="Calibri" w:hAnsi="Calibri" w:cs="Calibri"/>
+          <w:color w:val="4EA72E" w:themeColor="accent6"/>
         </w:rPr>
         <w:t xml:space="preserve"> </w:t>
       </w:r>
       <w:r>
         <w:rPr>
           <w:rFonts w:ascii="Calibri" w:hAnsi="Calibri" w:cs="Calibri"/>
+          <w:color w:val="4EA72E" w:themeColor="accent6"/>
         </w:rPr>
         <w:t xml:space="preserve">If you are not familiar with C++ vectors, use google to find </w:t>
       </w:r>
       <w:r>
         <w:rPr>
           <w:rFonts w:ascii="Calibri" w:hAnsi="Calibri" w:cs="Calibri"/>
+          <w:color w:val="4EA72E" w:themeColor="accent6"/>
         </w:rPr>
         <w:t xml:space="preserve">the C++ </w:t>
       </w:r>
       <w:r>
         <w:rPr>
           <w:rFonts w:ascii="Calibri" w:hAnsi="Calibri" w:cs="Calibri"/>
+          <w:color w:val="4EA72E" w:themeColor="accent6"/>
         </w:rPr>
         <w:t xml:space="preserve">documentation </w:t>
       </w:r>
       <w:r>
         <w:rPr>
           <w:rFonts w:ascii="Calibri" w:hAnsi="Calibri" w:cs="Calibri"/>
+          <w:color w:val="4EA72E" w:themeColor="accent6"/>
         </w:rPr>
         <w:t>for the vector class</w:t>
       </w:r>
       <w:r>
         <w:rPr>
           <w:rFonts w:ascii="Calibri" w:hAnsi="Calibri" w:cs="Calibri"/>
+          <w:color w:val="4EA72E" w:themeColor="accent6"/>
         </w:rPr>
         <w:t xml:space="preserve">. </w:t>
       </w:r>
       <w:r>
         <w:rPr>
           <w:rFonts w:ascii="Calibri" w:hAnsi="Calibri" w:cs="Calibri"/>
+          <w:color w:val="4EA72E" w:themeColor="accent6"/>
         </w:rPr>
         <w:t xml:space="preserve">Note: You will need to have a correctly implemented copy constructor in the </w:t>
       </w:r>
       <w:r>
         <w:rPr>
           <w:rFonts w:ascii="Calibri" w:hAnsi="Calibri" w:cs="Calibri"/>
+          <w:color w:val="4EA72E" w:themeColor="accent6"/>
         </w:rPr>
         <w:t>Person</w:t>
       </w:r>
       <w:r>
         <w:rPr>
           <w:rFonts w:ascii="Calibri" w:hAnsi="Calibri" w:cs="Calibri"/>
+          <w:color w:val="4EA72E" w:themeColor="accent6"/>
         </w:rPr>
         <w:t xml:space="preserve"> class for th</w:t>
       </w:r>
       <w:r>
         <w:rPr>
           <w:rFonts w:ascii="Calibri" w:hAnsi="Calibri" w:cs="Calibri"/>
+          <w:color w:val="4EA72E" w:themeColor="accent6"/>
         </w:rPr>
         <w:t xml:space="preserve">e “push_back” method to </w:t>
       </w:r>
       <w:r>
         <w:rPr>
           <w:rFonts w:ascii="Calibri" w:hAnsi="Calibri" w:cs="Calibri"/>
+          <w:color w:val="4EA72E" w:themeColor="accent6"/>
         </w:rPr>
         <w:t xml:space="preserve">work. Otherwise, you will be inserting empty </w:t>
       </w:r>
       <w:r>
         <w:rPr>
           <w:rFonts w:ascii="Calibri" w:hAnsi="Calibri" w:cs="Calibri"/>
+          <w:color w:val="4EA72E" w:themeColor="accent6"/>
         </w:rPr>
         <w:t>Person</w:t>
       </w:r>
       <w:r>
         <w:rPr>
           <w:rFonts w:ascii="Calibri" w:hAnsi="Calibri" w:cs="Calibri"/>
+          <w:color w:val="4EA72E" w:themeColor="accent6"/>
         </w:rPr>
         <w:t xml:space="preserve"> objects into the vector.</w:t>
       </w:r>

</xml_diff>